<commit_message>
Generer CV og ansøgning til 3 Fabian-valgte opslag (NielsenIQ, Accenture, Tech Collective)
Opdaterer også SQL-framing i profile.json efter Fabians direkte instruks:
SQL fremstilles ikke længere som en stærk kompetence, Power BI og Excel er klart stærkest.

Co-Authored-By: Claude Sonnet 5 <noreply@anthropic.com>
Claude-Session: https://claude.ai/code/session_01LsRSdB1qvG1cnwTDBen2NQ
</commit_message>
<xml_diff>
--- a/materials/Fabian_Hansen_Ansogning_NielsenIQ.docx
+++ b/materials/Fabian_Hansen_Ansogning_NielsenIQ.docx
@@ -79,7 +79,7 @@
           <w:sz w:val="22"/>
           <w:szCs w:val="22"/>
         </w:rPr>
-        <w:t xml:space="preserve">Dear Retailer Vertical Team,</w:t>
+        <w:t xml:space="preserve">Dear NielsenIQ,</w:t>
       </w:r>
     </w:p>
     <w:p>
@@ -93,7 +93,7 @@
           <w:sz w:val="22"/>
           <w:szCs w:val="22"/>
         </w:rPr>
-        <w:t xml:space="preserve">I saw the Analytical Consultant role on your Retailer Vertical team and knew straight away it was worth writing in about. Most analyst jobs make you pick a side, either you sit with the data or you sit with the client. This one does not, and that mix is exactly what I have been building toward.</w:t>
+        <w:t xml:space="preserve">I am writing to apply for the Analytical Consultant position at NielsenIQ. What draws me to this role is the combination of analytical depth and client relationships, turning data into recommendations that a client can actually act on, not just a report that sits in an inbox. That mix of analysis and trusted advisory is exactly the kind of work I enjoy most.</w:t>
       </w:r>
     </w:p>
     <w:p>
@@ -107,7 +107,7 @@
           <w:sz w:val="22"/>
           <w:szCs w:val="22"/>
         </w:rPr>
-        <w:t xml:space="preserve">At COWI I spend my days turning employee and financial data into Power BI dashboards that people actually rely on, sickness reports, manager validations, the annual salary regulation process for the whole Danish organisation. The technical side is only half of it though. The part I enjoy most is sitting with a stakeholder who does not care about the technical work behind the number, and walking them through what it actually means for their team. That is the same instinct your retailers would need me to bring every day, just pointed at FMCG data instead of payroll data.</w:t>
+        <w:t xml:space="preserve">At COWI, I build and maintain Power BI reports and dashboards covering people and financial data for an organisation of more than 7,500 employees, and I work directly with stakeholders across HR, Payroll and Finance in Denmark, Norway, Sweden and Iceland to turn their questions into reliable reporting. A large part of that job is structuring and analysing Excel-based data, spotting patterns and explaining what is driving them to people who then use that explanation to make decisions, which is very close to the day-to-day data support and insight delivery this role asks for.</w:t>
       </w:r>
     </w:p>
     <w:p>
@@ -121,7 +121,7 @@
           <w:sz w:val="22"/>
           <w:szCs w:val="22"/>
         </w:rPr>
-        <w:t xml:space="preserve">Before COWI I worked in B2B media sales at Teknologiens Mediehus, running full sales cycles in HubSpot from the first phone call to a signed deal. It taught me how to read a client, which relationships are worth the extra hour, and how to keep a conversation constructive even when the number is not the one someone hoped for. That kind of client instinct is not something most people applying with a purely analytical background bring with them, and I think it is exactly what makes client trust and satisfaction hold up over time rather than just look good in a quarterly report.</w:t>
+        <w:t xml:space="preserve">Before COWI, I spent two years as a Media Consultant at Teknologiens Mediehus, where I owned a portfolio of B2B accounts from first contact through to closed deal in HubSpot, and used commercial and customer data to identify opportunities and prioritise accounts. That client-facing side of the role, building relationships and being the person a client turns to, is something I genuinely enjoy and think maps well onto the trusted advisor part of this position.</w:t>
       </w:r>
     </w:p>
     <w:p>
@@ -135,7 +135,7 @@
           <w:sz w:val="22"/>
           <w:szCs w:val="22"/>
         </w:rPr>
-        <w:t xml:space="preserve">My master's at CBS in Economic Marketing is built around the same question, taking consumer and market data and turning it into something a business can actually act on, through statistical modelling, focus group research and translating the findings into recommendations a commercial team will actually use. It is the same instinct NielsenIQ needs when a retailer wants an answer, not a dataset.</w:t>
+        <w:t xml:space="preserve">My MSc in Economics and Marketing from CBS has trained me in both quantitative and qualitative market analysis, from statistical modelling to focus group research, always with the goal of turning that analysis into a clear, strategic recommendation. Combined with strong Excel and PowerPoint skills from my current role, I would be glad to bring that toolkit into the FMCG and retail space that NielsenIQ works in.</w:t>
       </w:r>
     </w:p>
     <w:p>
@@ -149,7 +149,7 @@
           <w:sz w:val="22"/>
           <w:szCs w:val="22"/>
         </w:rPr>
-        <w:t xml:space="preserve">I would genuinely like the chance to bring that combination to your team, and I am happy to talk through any of it whenever suits you. Thank you for taking the time to read this.</w:t>
+        <w:t xml:space="preserve">I am fluent in both Danish and English, and I would welcome the chance to talk about how my background in reporting, analysis and client relationships could contribute to your team. Thank you for considering my application.</w:t>
       </w:r>
     </w:p>
     <w:p>

</xml_diff>